<commit_message>
Remove development credential hints from login page
- Remove default owner login footer text from LoginForm
- Stop prefilling username with 'owner'
- Document verification in CLOSE-SHOP-UX-FIX certification report

Co-authored-by: Sonic-Media <Sonic-Media@users.noreply.github.com>
</commit_message>
<xml_diff>
--- a/docs/data-integrity/CLOSE-SHOP-UX-FIX.docx
+++ b/docs/data-integrity/CLOSE-SHOP-UX-FIX.docx
@@ -496,6 +496,85 @@
         <w:pStyle w:val="Heading2"/>
       </w:pPr>
       <w:r>
+        <w:t>Login page credential hint removal</w:t>
+      </w:r>
+    </w:p>
+    <w:p>
+      <w:r>
+        <w:t>Removed development-only copy from the user-facing sign-in page:</w:t>
+      </w:r>
+    </w:p>
+    <w:p>
+      <w:pPr>
+        <w:pStyle w:val="ListBullet"/>
+      </w:pPr>
+      <w:r>
+        <w:t>Deleted footer text: "Default owner login: username owner, password owner"</w:t>
+      </w:r>
+    </w:p>
+    <w:p>
+      <w:pPr>
+        <w:pStyle w:val="ListBullet"/>
+      </w:pPr>
+      <w:r>
+        <w:t>Removed prefilled username default (`owner` → empty field)</w:t>
+      </w:r>
+    </w:p>
+    <w:p>
+      <w:pPr>
+        <w:pStyle w:val="ListBullet"/>
+      </w:pPr>
+      <w:r>
+        <w:t>Searched all `components/` and `app/` UI: no other visible default usernames, passwords, or test-credential hints found</w:t>
+      </w:r>
+    </w:p>
+    <w:p>
+      <w:r>
+        <w:t>Authentication logic, users, passwords, schema, and env vars unchanged. Premium login layout preserved.</w:t>
+      </w:r>
+    </w:p>
+    <w:p>
+      <w:pPr>
+        <w:pStyle w:val="IntenseQuote"/>
+      </w:pPr>
+      <w:r>
+        <w:t>| Check | Result |</w:t>
+      </w:r>
+    </w:p>
+    <w:p>
+      <w:r>
+        <w:t>|-------|--------|</w:t>
+      </w:r>
+    </w:p>
+    <w:p>
+      <w:pPr>
+        <w:pStyle w:val="IntenseQuote"/>
+      </w:pPr>
+      <w:r>
+        <w:t>| `npx tsc --noEmit` | **PASS** |</w:t>
+      </w:r>
+    </w:p>
+    <w:p>
+      <w:pPr>
+        <w:pStyle w:val="IntenseQuote"/>
+      </w:pPr>
+      <w:r>
+        <w:t>| `/login` HTML — no credential hints | **PASS** |</w:t>
+      </w:r>
+    </w:p>
+    <w:p>
+      <w:pPr>
+        <w:pStyle w:val="IntenseQuote"/>
+      </w:pPr>
+      <w:r>
+        <w:t>| Browser UI — Sign in, Username, Password, Sign In only | **PASS** |</w:t>
+      </w:r>
+    </w:p>
+    <w:p>
+      <w:pPr>
+        <w:pStyle w:val="Heading2"/>
+      </w:pPr>
+      <w:r>
         <w:t>Environment / fixture notes</w:t>
       </w:r>
     </w:p>

</xml_diff>